<commit_message>
ACTS-117: sharpen vision/problem seam in PRD v3 + re-export docx
Make the narrowing intentional: add a bridge sentence to the Solution-Idea
block (vision is larger than the MVP; ACTS attacks the customized-prayer
slice first), hedge §1A to future tense (Insights/Wisdom are the horizon,
not built), and lead "The problem I'm solving" with a one-line scope
(prayer composition today, not longitudinal insight). Re-export ACTS-PRD-v3.docx.

Co-Authored-By: Claude Opus 4.8 <noreply@anthropic.com>
</commit_message>
<xml_diff>
--- a/docs/ACTS-PRD-v3.docx
+++ b/docs/ACTS-PRD-v3.docx
@@ -419,7 +419,24 @@
         <w:spacing w:after="100"/>
       </w:pPr>
       <w:r>
-        <w:t xml:space="preserve">A person's faith journey is shaped not only by prayer, but also by what they read, watch, hear, experience, question, and reflect on. ACTS captures Faith Learning alongside prayer and lived experience so users can make connections over time — turning what they encounter into Reflection, recognizing Insights, and carrying forward Wisdom that can support discernment and action.</w:t>
+        <w:t xml:space="preserve">A person's faith journey is shaped not only by prayer, but also by what they read, watch, hear, experience, question, and reflect on. ACTS is </w:t>
+      </w:r>
+      <w:r>
+        <w:rPr>
+          <w:i/>
+          <w:iCs/>
+        </w:rPr>
+        <w:t xml:space="preserve">designed</w:t>
+      </w:r>
+      <w:r>
+        <w:t xml:space="preserve"> to capture Faith Learning alongside prayer and lived experience so that, over time, users can make connections — turning what they encounter into Reflection, and eventually recognizing Insights and carrying forward Wisdom that can support discernment and action. </w:t>
+      </w:r>
+      <w:r>
+        <w:rPr>
+          <w:i/>
+          <w:iCs/>
+        </w:rPr>
+        <w:t xml:space="preserve">These later layers (Insights, Wisdom) are the vision's horizon, not the MVP — see the narrowing below.</w:t>
       </w:r>
     </w:p>
     <w:p>
@@ -1203,6 +1220,41 @@
     </w:p>
     <w:p>
       <w:pPr>
+        <w:spacing w:after="100"/>
+      </w:pPr>
+      <w:r>
+        <w:rPr>
+          <w:b/>
+          <w:bCs/>
+        </w:rPr>
+        <w:t xml:space="preserve">The vision is deliberately larger than what ACTS solves today.</w:t>
+      </w:r>
+      <w:r>
+        <w:t xml:space="preserve"> Part 1 describes the full faith journey — all the way to Insights, Wisdom, and longitudinal discernment. ACTS attacks </w:t>
+      </w:r>
+      <w:r>
+        <w:rPr>
+          <w:b/>
+          <w:bCs/>
+        </w:rPr>
+        <w:t xml:space="preserve">one slice of it first: the customized-prayer problem.</w:t>
+      </w:r>
+      <w:r>
+        <w:t xml:space="preserve"> The Insights/Wisdom/longitudinal-intelligence layers are the horizon we're building </w:t>
+      </w:r>
+      <w:r>
+        <w:rPr>
+          <w:i/>
+          <w:iCs/>
+        </w:rPr>
+        <w:t xml:space="preserve">toward</w:t>
+      </w:r>
+      <w:r>
+        <w:t xml:space="preserve">, not the MVP — so the specific problem below is intentionally scoped narrower than the vision, and the two should not be read as the same size.</w:t>
+      </w:r>
+    </w:p>
+    <w:p>
+      <w:pPr>
         <w:pStyle w:val="Heading2"/>
         <w:spacing w:after="100" w:before="240"/>
       </w:pPr>
@@ -1243,6 +1295,32 @@
           <w:bCs/>
         </w:rPr>
         <w:t xml:space="preserve">The problem I'm solving</w:t>
+      </w:r>
+    </w:p>
+    <w:p>
+      <w:pPr>
+        <w:spacing w:after="100"/>
+      </w:pPr>
+      <w:r>
+        <w:rPr>
+          <w:i/>
+          <w:iCs/>
+        </w:rPr>
+        <w:t xml:space="preserve">The problem ACTS solves </w:t>
+      </w:r>
+      <w:r>
+        <w:rPr>
+          <w:i/>
+          <w:iCs/>
+        </w:rPr>
+        <w:t xml:space="preserve">today</w:t>
+      </w:r>
+      <w:r>
+        <w:rPr>
+          <w:i/>
+          <w:iCs/>
+        </w:rPr>
+        <w:t xml:space="preserve"> is prayer composition — praying the way your family and your church actually pray, with Scripture woven in — not longitudinal insight. That larger problem is real, but it's later.</w:t>
       </w:r>
     </w:p>
     <w:p>
@@ -3168,6 +3246,208 @@
       </w:pPr>
       <w:r>
         <w:t xml:space="preserve">Custom</w:t>
+      </w:r>
+    </w:p>
+    <w:p>
+      <w:pPr>
+        <w:pStyle w:val="Heading3"/>
+        <w:spacing w:after="100" w:before="240"/>
+      </w:pPr>
+      <w:r>
+        <w:rPr>
+          <w:b/>
+          <w:bCs/>
+        </w:rPr>
+        <w:t xml:space="preserve">What a novena is *(domain reference — grounds the novena roadmap, ACTS-107 → ACTS-122–128)*</w:t>
+      </w:r>
+    </w:p>
+    <w:p>
+      <w:pPr>
+        <w:spacing w:after="100"/>
+      </w:pPr>
+      <w:r>
+        <w:t xml:space="preserve">A </w:t>
+      </w:r>
+      <w:r>
+        <w:rPr>
+          <w:b/>
+          <w:bCs/>
+        </w:rPr>
+        <w:t xml:space="preserve">novena</w:t>
+      </w:r>
+      <w:r>
+        <w:t xml:space="preserve"> is a traditional Christian — most commonly Catholic — devotion of </w:t>
+      </w:r>
+      <w:r>
+        <w:rPr>
+          <w:b/>
+          <w:bCs/>
+        </w:rPr>
+        <w:t xml:space="preserve">prayer repeated over nine consecutive days</w:t>
+      </w:r>
+      <w:r>
+        <w:t xml:space="preserve">. The name comes from the Latin </w:t>
+      </w:r>
+      <w:r>
+        <w:rPr>
+          <w:i/>
+          <w:iCs/>
+        </w:rPr>
+        <w:t xml:space="preserve">novem</w:t>
+      </w:r>
+      <w:r>
+        <w:t xml:space="preserve"> ("nine"), and the practice is inspired by the nine days the Apostles, Mary, and the disciples spent in constant prayer in the Upper Room between the Ascension and Pentecost. This is why a novena in ACTS is modeled as a </w:t>
+      </w:r>
+      <w:r>
+        <w:rPr>
+          <w:b/>
+          <w:bCs/>
+        </w:rPr>
+        <w:t xml:space="preserve">day-sequenced flow ("Day N of M")</w:t>
+      </w:r>
+      <w:r>
+        <w:t xml:space="preserve">, not a single session — the countdown </w:t>
+      </w:r>
+      <w:r>
+        <w:rPr>
+          <w:i/>
+          <w:iCs/>
+        </w:rPr>
+        <w:t xml:space="preserve">is</w:t>
+      </w:r>
+      <w:r>
+        <w:t xml:space="preserve"> the devotion.</w:t>
+      </w:r>
+    </w:p>
+    <w:p>
+      <w:pPr>
+        <w:spacing w:after="100"/>
+      </w:pPr>
+      <w:r>
+        <w:t xml:space="preserve">People pray a novena for one of four purposes, which the app should be able to frame around a session:</w:t>
+      </w:r>
+    </w:p>
+    <w:p>
+      <w:pPr>
+        <w:pStyle w:val="ListParagraph"/>
+        <w:numPr>
+          <w:ilvl w:val="0"/>
+          <w:numId w:val="1"/>
+        </w:numPr>
+        <w:spacing w:after="40"/>
+      </w:pPr>
+      <w:r>
+        <w:rPr>
+          <w:b/>
+          <w:bCs/>
+        </w:rPr>
+        <w:t xml:space="preserve">Petition</w:t>
+      </w:r>
+      <w:r>
+        <w:t xml:space="preserve"> — to ask God for a specific favor, healing, or grace.</w:t>
+      </w:r>
+    </w:p>
+    <w:p>
+      <w:pPr>
+        <w:pStyle w:val="ListParagraph"/>
+        <w:numPr>
+          <w:ilvl w:val="0"/>
+          <w:numId w:val="1"/>
+        </w:numPr>
+        <w:spacing w:after="40"/>
+      </w:pPr>
+      <w:r>
+        <w:rPr>
+          <w:b/>
+          <w:bCs/>
+        </w:rPr>
+        <w:t xml:space="preserve">Intercession</w:t>
+      </w:r>
+      <w:r>
+        <w:t xml:space="preserve"> — to ask a saint or the Blessed Virgin Mary to pray on one's behalf.</w:t>
+      </w:r>
+    </w:p>
+    <w:p>
+      <w:pPr>
+        <w:pStyle w:val="ListParagraph"/>
+        <w:numPr>
+          <w:ilvl w:val="0"/>
+          <w:numId w:val="1"/>
+        </w:numPr>
+        <w:spacing w:after="40"/>
+      </w:pPr>
+      <w:r>
+        <w:rPr>
+          <w:b/>
+          <w:bCs/>
+        </w:rPr>
+        <w:t xml:space="preserve">Preparation</w:t>
+      </w:r>
+      <w:r>
+        <w:t xml:space="preserve"> — to spiritually prepare for a major feast (Christmas, Divine Mercy Sunday, a patronal feast).</w:t>
+      </w:r>
+    </w:p>
+    <w:p>
+      <w:pPr>
+        <w:pStyle w:val="ListParagraph"/>
+        <w:numPr>
+          <w:ilvl w:val="0"/>
+          <w:numId w:val="1"/>
+        </w:numPr>
+        <w:spacing w:after="40"/>
+      </w:pPr>
+      <w:r>
+        <w:rPr>
+          <w:b/>
+          <w:bCs/>
+        </w:rPr>
+        <w:t xml:space="preserve">Perseverance</w:t>
+      </w:r>
+      <w:r>
+        <w:t xml:space="preserve"> — to build patience, humility, and persistence through repeated prayer.</w:t>
+      </w:r>
+    </w:p>
+    <w:p>
+      <w:pPr>
+        <w:spacing w:after="100"/>
+      </w:pPr>
+      <w:r>
+        <w:t xml:space="preserve">A novena's daily content may be the </w:t>
+      </w:r>
+      <w:r>
+        <w:rPr>
+          <w:b/>
+          <w:bCs/>
+        </w:rPr>
+        <w:t xml:space="preserve">same prayer each day</w:t>
+      </w:r>
+      <w:r>
+        <w:t xml:space="preserve"> (e.g. the St. Andrew Christmas novena, prayed repeatedly) or a </w:t>
+      </w:r>
+      <w:r>
+        <w:rPr>
+          <w:b/>
+          <w:bCs/>
+        </w:rPr>
+        <w:t xml:space="preserve">different prayer/meditation per day</w:t>
+      </w:r>
+      <w:r>
+        <w:t xml:space="preserve"> (day-indexed) — both shapes are covered by the "Novena Prayers" pattern (ACTS-123), while swappable rosary/litany/chaplet blocks come from the scaffold (ACTS-107/ACTS-122).</w:t>
+      </w:r>
+    </w:p>
+    <w:p>
+      <w:pPr>
+        <w:spacing w:after="100"/>
+      </w:pPr>
+      <w:r>
+        <w:rPr>
+          <w:i/>
+          <w:iCs/>
+        </w:rPr>
+        <w:t xml:space="preserve">Sources (Gemini-gathered):</w:t>
+      </w:r>
+      <w:r>
+        <w:t xml:space="preserve"> Dynamic Catholic, FOCUS, Shrine of Divine Mercy, Benedictine, St. Mike's, Catholic Straight Answers.</w:t>
       </w:r>
     </w:p>
     <w:p>

</xml_diff>